<commit_message>
AI model usage doc: add end-to-end flow overview + worked example for §4
4-1/4-2/4-3 described each stage but never connected them into one
narrative, so it wasn't obvious how a raw document actually becomes a
published index -- added an overview at the top of §4 walking through
the three stages as one pipeline (unstructured doc -> LLM event ->
deterministic index formula -> NB2 probability -> published to DB, feeds
into §2's diagnosis model), plus a worked example: an illustrative REE
export-control headline through steps ①-②, and real verified NB2 output
for step ③ (REE week of 2026-07-05: lambda=6.56, p_severe=81.2%,
p_burst=51.7%, contrasted with CU's high p_severe/low p_burst the same
week to show the two probabilities carry different information).

Co-Authored-By: Claude Sonnet 5 <noreply@anthropic.com>
</commit_message>
<xml_diff>
--- a/documents/산출물/2026-W30_0720-0726/AI모델_사용안_260722.docx
+++ b/documents/산출물/2026-W30_0720-0726/AI모델_사용안_260722.docx
@@ -286,6 +286,98 @@
       </w:pPr>
       <w:r>
         <w:t>4. 지정학 위기지수</w:t>
+      </w:r>
+    </w:p>
+    <w:p>
+      <w:pPr/>
+      <w:r>
+        <w:t>지정학 위기지수는 아래 3단계가 순서대로 이어져 하나의 파이프라인을 이룹니다 — 각 단계의 출력이 다음 단계의 입력이 됩니다.</w:t>
+      </w:r>
+    </w:p>
+    <w:p>
+      <w:pPr>
+        <w:pStyle w:val="ListBullet"/>
+      </w:pPr>
+      <w:r>
+        <w:rPr>
+          <w:b/>
+        </w:rPr>
+        <w:t xml:space="preserve">① 비정형 원문 → 정형 이벤트(4-1, LLM): </w:t>
+      </w:r>
+      <w:r>
+        <w:t>뉴스·공시 원문 한 건을 LLM이 읽고 '광종·사건유형·심각도·방향·국가·근거 인용'이 채워진 구조화된 이벤트 1건(또는 0건, 무관하면 버림)으로 변환합니다.</w:t>
+      </w:r>
+    </w:p>
+    <w:p>
+      <w:pPr>
+        <w:pStyle w:val="ListBullet"/>
+      </w:pPr>
+      <w:r>
+        <w:rPr>
+          <w:b/>
+        </w:rPr>
+        <w:t xml:space="preserve">② 이벤트들 → 지수 0~100(4-2, 결정론적 공식): </w:t>
+      </w:r>
+      <w:r>
+        <w:t>①에서 쌓인 이벤트들을 광종별로 모아, 심각도·발행처 신뢰도·공급집중도·한국 수입의존도 등(기존 데이터)과 결합한 고정된 수식으로 하나의 숫자(0~100)로 압축합니다. 이게 매주 갱신되는 지정학위기지수(geo_index)입니다.</w:t>
+      </w:r>
+    </w:p>
+    <w:p>
+      <w:pPr>
+        <w:pStyle w:val="ListBullet"/>
+      </w:pPr>
+      <w:r>
+        <w:rPr>
+          <w:b/>
+        </w:rPr>
+        <w:t xml:space="preserve">③ 지수·추세 → 다음 주 발생확률(4-3, NB2 통계모델): </w:t>
+      </w:r>
+      <w:r>
+        <w:t>②에서 나온 지수와 최근 심각 이벤트 추세를 통계모델에 넣어 '다음 주 심각 이벤트가 터질 확률'·'급증확률'(geo_prob)을 추가로 산출합니다.</w:t>
+      </w:r>
+    </w:p>
+    <w:p>
+      <w:pPr/>
+      <w:r>
+        <w:t>geo_index와 geo_prob 둘 다 운영 DB에 발행되어, 2장의 수급위기 진단모델 입력 피처로 쓰이고 대시보드에도 그대로 표시됩니다 — 즉 4장 전체가 2장 모델의 핵심 입력을 만드는 과정입니다.</w:t>
+      </w:r>
+    </w:p>
+    <w:p>
+      <w:pPr>
+        <w:pStyle w:val="Heading2"/>
+      </w:pPr>
+      <w:r>
+        <w:t>예시로 흐름 따라가기</w:t>
+      </w:r>
+    </w:p>
+    <w:p>
+      <w:pPr/>
+      <w:r>
+        <w:t>구체적인 수치 흐름을 예로 들면(①·②는 형식을 보여주기 위한 예시값, ③은 2026-07-05 주 실제 운영 산출값입니다):</w:t>
+      </w:r>
+    </w:p>
+    <w:p>
+      <w:pPr>
+        <w:pStyle w:val="ListBullet"/>
+      </w:pPr>
+      <w:r>
+        <w:t>① 원문 예시: '중국, 희토류 영구자석 원료 수출허가제 강화' 뉴스 한 건 → LLM 추출 결과 {광종: REE, 사건유형: 정책(수출규제), 심각도: 3(최고), 방향: 공급감소, 국가: 중국}.</w:t>
+      </w:r>
+    </w:p>
+    <w:p>
+      <w:pPr>
+        <w:pStyle w:val="ListBullet"/>
+      </w:pPr>
+      <w:r>
+        <w:t>② 지수화 예시: 이 이벤트는 심각도가 최고(3)이고, REE는 원래 공급집중도(중국 생산점유)가 매우 높아 공급집중도·이중노출가중이 다른 광종보다 크게 붙습니다 — 그래서 같은 심각도라도 REE 지수에 대한 기여가 상대적으로 큽니다. 이런 이벤트들이 그 주 REE 이벤트 전체와 합산 정규화되어 그 주의 REE 지정학위기지수(0~100)가 나옵니다.</w:t>
+      </w:r>
+    </w:p>
+    <w:p>
+      <w:pPr>
+        <w:pStyle w:val="ListBullet"/>
+      </w:pPr>
+      <w:r>
+        <w:t>③ 확률화 실측값(2026-07-05 주, 실제 운영 산출): REE — 주간강도(λ)=6.56, 다음 주 심각이벤트 발생확률=81.2%, 급증확률=51.7%. 같은 주 CU는 발생확률 99.98%지만 급증확률은 3.4%로 훨씬 낮습니다 — '터질 확률은 높지만 평소보다 이례적으로 몰릴 확률은 낮다'는 뜻으로, 두 지표가 서로 다른 정보를 담고 있음을 보여줍니다.</w:t>
       </w:r>
     </w:p>
     <w:p>

</xml_diff>

<commit_message>
AI model usage doc: replace vague §4-3 bullets with the actual formula
Swapped the hand-wavy "uses recent trend and the index" bullets for the
real regression: lambda = exp(b0 + b1*x_ewma + b2*x_geo + b3*x_vol) fit
per commodity into a NegativeBinomialP distribution,
P(severe>=1) = 1-(1+a*lambda)^(-1/a), burst probability at the P90
threshold of the training-period distribution. Added the actual
per-commodity alpha/burst-threshold/Brier numbers from this session's
retrain run -- CU/NI/REE beat the constant-intensity baseline, CO/LI
don't (small samples), stated plainly rather than only citing the wins.
Also the isotonic calibration's actual before/after Brier and ECE.

Co-Authored-By: Claude Sonnet 5 <noreply@anthropic.com>
</commit_message>
<xml_diff>
--- a/documents/산출물/2026-W30_0720-0726/AI모델_사용안_260722.docx
+++ b/documents/산출물/2026-W30_0720-0726/AI모델_사용안_260722.docx
@@ -589,11 +589,9 @@
       </w:r>
     </w:p>
     <w:p>
-      <w:pPr>
-        <w:pStyle w:val="ListBullet"/>
-      </w:pPr>
+      <w:pPr/>
       <w:r>
-        <w:t>입력: 최근 심각 이벤트 수의 추세(지수가중이동평균)·해당 주 지정학위기지수·그 주의 전체 보도량.</w:t>
+        <w:t>회귀식(광종별 개별 적합): 주간 강도 λ = exp(β₀ + β₁·x_ewma + β₂·x_geo + β₃·x_vol) — x_ewma=최근 심각(severity≥2) 이벤트 수의 지수가중이동평균(반감기 4주, '관성' 성분), x_geo=그 주의 지정학위기지수(4-2 산출값), x_vol=log(1+그 주 전체 이벤트 수). 이 λ를 음이항분포(NegativeBinomialP, 과산포지수 α는 광종별로 데이터에서 추정)에 넣어 확률을 계산합니다: P(다음 주 심각 이벤트 ≥1건) = 1-(1+αλ)^(-1/α). '급증확률'은 같은 분포에서 P(심각 이벤트 수 ≥ 임계값)으로 계산하며, 임계값은 광종별 학습기간 분포의 상위 10%(P90) 지점(최소 2건)으로 정합니다.</w:t>
       </w:r>
     </w:p>
     <w:p>
@@ -601,7 +599,13 @@
         <w:pStyle w:val="ListBullet"/>
       </w:pPr>
       <w:r>
-        <w:t>산출: 다음 주 심각 이벤트 발생확률, 그리고 평상시 대비 이례적으로 많은 이벤트가 몰릴 '급증확률' — 사후보정(isotonic 회귀)까지 거쳐 함께 제공합니다.</w:t>
+        <w:rPr>
+          <w:b/>
+        </w:rPr>
+        <w:t xml:space="preserve">왜 음이항(포아송이 아니라)인가 — </w:t>
+      </w:r>
+      <w:r>
+        <w:t>실측 결과 광종별 주간 이벤트 수의 분산이 평균의 3.7~6.6배로 나타나(포아송이면 분산=평균이어야 함) '위기가 위기를 부르는' 군집 발생 특성이 뚜렷했습니다. 그래서 과산포를 명시적으로 다루는 음이항 모델을 채택했습니다.</w:t>
       </w:r>
     </w:p>
     <w:p>
@@ -609,7 +613,27 @@
         <w:pStyle w:val="ListBullet"/>
       </w:pPr>
       <w:r>
-        <w:t>지정학 이벤트는 '위기가 위기를 부르는' 군집 발생 특성이 있음을 실측으로 확인했습니다(분산이 평균의 3.7~6.6배로, 단순 포아송 가정이 기각됨) — 그래서 이 특성을 반영할 수 있는 음이항 모델을 채택했습니다.</w:t>
+        <w:rPr>
+          <w:b/>
+        </w:rPr>
+        <w:t xml:space="preserve">광종별 검증 결과(2026-07 재계산, train~2023/test 2024+, Brier score 기준) — </w:t>
+      </w:r>
+      <w:r>
+        <w:t>CU(α=0.27, 급증임계=주 174건) Brier 0.046 vs 상수강도 기준선 0.047(개선) / NI(α=0.42, 임계 70건) 0.047 vs 0.053(개선) / REE(α=1.83, 임계 4건) 0.208 vs 0.475(크게 개선) / CO(α=1.19, 임계 8건) 0.212 vs 0.195(기준선 대비 열세) / LI(α=0.98, 임계 16건) 0.113 vs 0.108(기준선 대비 열세). 5광종 중 3개(CU·NI·REE)는 상수강도 기준선보다 명확히 낫고, 2개(CO·LI)는 표본이 작아 기준선 대비 근소하게 열세 — 광종별 성능 편차가 있다는 점을 투명하게 병기합니다.</w:t>
+      </w:r>
+    </w:p>
+    <w:p>
+      <w:pPr>
+        <w:pStyle w:val="ListBullet"/>
+      </w:pPr>
+      <w:r>
+        <w:rPr>
+          <w:b/>
+        </w:rPr>
+        <w:t xml:space="preserve">사후보정(isotonic) — </w:t>
+      </w:r>
+      <w:r>
+        <w:t>raw 급증확률을 그대로 쓰면 과신(overconfidence) 경향이 있어, 별도 검증셋(적합 390쌍/평가 260쌍)으로 isotonic 회귀 보정을 적용합니다 — 보정 후 Brier 0.1203→0.1194, ECE(기대보정오차) 0.083→0.081로 소폭 개선되어 확률값 자체의 신뢰도가 높아집니다.</w:t>
       </w:r>
     </w:p>
     <w:p>

</xml_diff>